<commit_message>
Align funding-law paragraphs with the statute text (sections 3, 12, 14)
Co-Authored-By: Claude Opus 5.5 <noreply@anthropic.com>
Claude-Session: https://claude.ai/code/session_01BAqU98RYExznE8k31F3Ngz
</commit_message>
<xml_diff>
--- a/legal-opinions/חוות-דעת-פיצול-עתיד-טוב-האיחוד-הלאומי-תקומה.docx
+++ b/legal-opinions/חוות-דעת-פיצול-עתיד-טוב-האיחוד-הלאומי-תקומה.docx
@@ -612,7 +612,17 @@
         <w:jc w:val="both"/>
       </w:pPr>
       <w:r>
-        <w:t xml:space="preserve">סעיף 3(ב1) לחוק המימון קובע כי מימון הוצאות הבחירות של מפלגות שהגישו רשימת מועמדים משותפת יחושב לכל מפלגה בנפרד. סעיף 3(ג) קובע כי המימון החודשי של ההוצאות השוטפות לסיעה יהיה בסכום של 6% מיחידת מימון אחת לכל מנדט, בתוספת סכום של 6% מיחידת מימון אחת – סכום בסיסי שכל סיעה זכאית לו.</w:t>
+        <w:t xml:space="preserve">חוק המימון מבחין בין שני סוגי מימון: מימון הוצאות הבחירות ומימון ההוצאות השוטפות. לעניין </w:t>
+      </w:r>
+      <w:r>
+        <w:rPr>
+          <w:b/>
+          <w:bCs/>
+        </w:rPr>
+        <w:t xml:space="preserve">מימון הוצאות הבחירות</w:t>
+      </w:r>
+      <w:r>
+        <w:t xml:space="preserve">, קובע סעיף 3(ב) לחוק המימון כי המימון יהיה לפי מספר יחידות מימון שנתקבל ממספר המנדטים שבהם זכתה הסיעה בכנסת היוצאת בתוספת מספר המנדטים שבהם זכתה בכנסת הנכנסת, מחולק בשתיים, "בתוספת סכום השווה ל-1.4 יחידות מימון" (ולגבי סיעה חדשה – יחידת מימון אחת לכל מנדט, בתוספת 1.4 יחידות מימון, כאמור בסעיף 3(א)(1)).</w:t>
       </w:r>
     </w:p>
     <w:p>
@@ -622,7 +632,7 @@
         <w:jc w:val="both"/>
       </w:pPr>
       <w:r>
-        <w:t xml:space="preserve">סעיף 12(א) לחוק המימון הוא הוראת המפתח לענייננו, וזו לשונו: "אם סיעה היא צירוף של שתי מפלגות או יותר שהגישו רשימת מועמדים משותפת והמקיימות בכנסת סיעה אחת, יראו את אותן מפלגות כאילו היו סיעות נפרדות בכל הנוגע למימון הוצאות שוטפות, להלוואה לפי סעיף 7ג ולתרומה לפי סעיף 8".</w:t>
+        <w:t xml:space="preserve">סעיף 3(ב1) לחוק המימון קובע כי מימון הוצאות הבחירות של מפלגות שהגישו רשימת מועמדים משותפת "יחושב לכל מפלגה בנפרד", בין שחשבון הבחירות מנוהל בנפרד ובין שבמשותף; ואולם תוספת הסכום השווה ל-1.4 יחידות מימון "תשולם פעם אחת לכל המפלגות כאמור", ותחולק ביניהן לפי שיעור חלקן בפועל בסך המימון. סעיף 3(ב2) מוסיף וקובע כי מקום שנערך הסכם מימון שוטף, יראו לעניין מימון הוצאות הבחירות את מספר המנדטים של כל מפלגה שהיא צד להסכם כמספר הנגזר משיעור המימון החודשי לפי ההסכם, אלא אם נקבע בהסכם כי הוראה זו לא תחול (וראו גם סעיף 4(א)(4) לחוק המימון, לעניין המקדמה). הוראות אלו הן שעליהן נסמך סעיף 9ב להסכם.</w:t>
       </w:r>
     </w:p>
     <w:p>
@@ -632,7 +642,47 @@
         <w:jc w:val="both"/>
       </w:pPr>
       <w:r>
-        <w:t xml:space="preserve">סעיף 12(ד) לחוק המימון מאפשר מנגנון של הסכם מימון שוטף, שבמסגרתו חלק מהמימון החודשי של סיעה נפרדת אחת ישולם לסיעה נפרדת אחרת באותו צירוף, ובלבד שההסכם הוגש ליושב ראש ועדת הבחירות המרכזית בעת הגשת הרשימה.</w:t>
+        <w:t xml:space="preserve">לעניין </w:t>
+      </w:r>
+      <w:r>
+        <w:rPr>
+          <w:b/>
+          <w:bCs/>
+        </w:rPr>
+        <w:t xml:space="preserve">מימון ההוצאות השוטפות</w:t>
+      </w:r>
+      <w:r>
+        <w:t xml:space="preserve">, קובע סעיף 3(ג) לחוק המימון כי "המימון החודשי של ההוצאות השוטפות לסיעה יהיה בסכום של 6% מיחידת מימון אחת לכל מנדט שבו זכתה הסיעה בבחירות לכנסת, בתוספת סכום של 6% מיחידת מימון אחת". הנה כי כן, נוסף על המימון לפי מספר המנדטים, זכאית כל סיעה לסכום בסיסי של 6% מיחידת מימון. משמפלגות ברשימה משותפת נחשבות לעניין זה כסיעות נפרדות (סעיף 12(א) לחוק המימון, כמפורט להלן), זכאית כל אחת מהן לסכום הבסיסי האמור.</w:t>
+      </w:r>
+    </w:p>
+    <w:p>
+      <w:pPr>
+        <w:pStyle w:val="a"/>
+        <w:spacing w:before="240" w:after="240" w:line="360" w:lineRule="auto"/>
+        <w:jc w:val="both"/>
+      </w:pPr>
+      <w:r>
+        <w:t xml:space="preserve">יודגש כי המחוקק נתן דעתו במפורש למצב של מפלגות הרצות ברשימה משותפת: לעניין מימון הוצאות הבחירות הוא קבע כי תוספת 1.4 יחידות המימון תשולם פעם אחת בלבד לכל המפלגות ברשימה (סעיף 3(ב1)), ואילו לעניין מימון ההוצאות השוטפות לא קבע כל הגבלה דומה, אלא הורה במפורש כי כל מפלגה ברשימה תיחשב סיעה נפרדת (סעיף 12(א)). מכאן, שקבלת הסכום הבסיסי של המימון השוטף על ידי כל אחת מהמפלגות ברשימה המשותפת היא תוצאה שהמחוקק ראה לנגד עיניו ובחר בה.</w:t>
+      </w:r>
+    </w:p>
+    <w:p>
+      <w:pPr>
+        <w:pStyle w:val="a"/>
+        <w:spacing w:before="240" w:after="240" w:line="360" w:lineRule="auto"/>
+        <w:jc w:val="both"/>
+      </w:pPr>
+      <w:r>
+        <w:t xml:space="preserve">סעיף 12(א) לחוק המימון הוא הוראת המפתח לענייננו, וזו לשונו: "אם סיעה היא צירוף של שתי מפלגות או יותר שהגישו רשימת מועמדים משותפת והמקיימות בכנסת סיעה אחת, יראו את אותן מפלגות כאילו היו סיעות נפרדות בכל הנוגע למימון הוצאות שוטפות, להלוואה לפי סעיף 7ג ולתרומה לפי סעיף 8, למעט תרומה בשנה שמתקיימות בה בחירות לכנסת".</w:t>
+      </w:r>
+    </w:p>
+    <w:p>
+      <w:pPr>
+        <w:pStyle w:val="a"/>
+        <w:spacing w:before="240" w:after="240" w:line="360" w:lineRule="auto"/>
+        <w:jc w:val="both"/>
+      </w:pPr>
+      <w:r>
+        <w:t xml:space="preserve">סעיף 12(ב) לחוק המימון קובע כי התשלומים למימון ההוצאות השוטפות ישולמו לסיעות הנפרדות בהתאם להשתייכות המפלגתית של חבריהן, כפי שנמסרה עם הגשת רשימת המועמדים המשותפת לפי סעיף 57(ב) לחוק הבחירות. סעיף 12(ד)(1) מוסיף ומאפשר כי חלק מהמימון החודשי לפי סעיף 3(ג) המגיע לסיעה נפרדת ישולם לסיעה נפרדת אחרת באותו צירוף, ובלבד שהתשלום הוא על פי "הסכם מימון שוטף" – קרי, הסכם בין המפלגות שהוגש ליושב ראש ועדת הבחירות המרכזית בעת הגשת רשימת המועמדים המשותפת (סעיף 1 לחוק המימון); חלק המימון המועבר נקוב באחוזים מיחידת המימון, ואינו יכול לעלות, ככלל, על שיעור המימון למנדט אחד. לפי סעיף 12(ד)(2), לא ניתן לשנות או לבטל הסכם כזה במהלך כהונתה של אותה כנסת.</w:t>
       </w:r>
     </w:p>
     <w:p>
@@ -679,7 +729,7 @@
         <w:t xml:space="preserve">שקיפות מלאה.</w:t>
       </w:r>
       <w:r>
-        <w:t xml:space="preserve"> ההסכם בין המפלגות הוגש ליושב ראש ועדת הבחירות המרכזית בעת הגשת רשימת המועמדים המשותפת, בדיוק כנדרש בסעיפים 1, 12(ד) ו-13ב(ד) לחוק המימון. ההשתייכות המפלגתית של כל אחד מהמועמדים נמסרה כדין בהתאם לסעיף 57 לחוק הבחירות. ההסכם אף מפרט במפורש את הסטת יחידת המימון בין המפלגות (סעיף 9 להסכם). לא נעשה כל ניסיון להסתיר את המבנה הפנימי של הרשימה או את קיומן של מפלגות נפרדות במסגרתה.</w:t>
+        <w:t xml:space="preserve"> ההסכם בין המפלגות הוגש ליושב ראש ועדת הבחירות המרכזית בעת הגשת רשימת המועמדים המשותפת, בדיוק כנדרש בסעיפים 1, 12(ד) ו-13ב(ד) לחוק המימון. ההשתייכות המפלגתית של כל אחד מהמועמדים נמסרה כדין בהתאם לסעיף 57(ב) לחוק הבחירות ולסעיף 12(ב) לחוק המימון. ההסכם אף מפרט במפורש את הסטת יחידת המימון בין המפלגות (סעיף 9 להסכם). לא נעשה כל ניסיון להסתיר את המבנה הפנימי של הרשימה או את קיומן של מפלגות נפרדות במסגרתה.</w:t>
       </w:r>
     </w:p>
     <w:p>
@@ -811,7 +861,7 @@
         <w:t xml:space="preserve">בא כוח עצמאי.</w:t>
       </w:r>
       <w:r>
-        <w:t xml:space="preserve"> סעיף 14 לחוק המימון קובע כי הודעות והצהרות של סיעה לפי החוק יבואו מאת בא כוחה. עתיד טוב פועלת באמצעות בא כוח משלה, מר יהושע לבנון, אשר חתם בשמה על ההסכם, בנפרד מבא כוחה של האיחוד הלאומי תקומה.</w:t>
+        <w:t xml:space="preserve"> סעיף 14(א) לחוק המימון קובע כי הודעות והצהרות של סיעה לפי החוק יבואו מאת בא כוח הסיעה; ולפי סעיף 14(ב), באי כוח המפלגות שהגישו רשימת מועמדים משותפת יהיו באי כוח הסיעות הנפרדות בכנסת. עתיד טוב פועלת באמצעות בא כוח משלה, מר יהושע לבנון, אשר חתם בשמה על ההסכם, בנפרד מבא כוחה של האיחוד הלאומי תקומה.</w:t>
       </w:r>
     </w:p>
     <w:p>

</xml_diff>